<commit_message>
fix: readme & ai-logs
</commit_message>
<xml_diff>
--- a/AI_Working_Log_Kvarta_Coffee.docx
+++ b/AI_Working_Log_Kvarta_Coffee.docx
@@ -4,6 +4,15 @@
   <w:body>
     <w:sdt>
       <w:sdtPr>
+        <w:rPr>
+          <w:rFonts w:asciiTheme="minorHAnsi" w:eastAsiaTheme="minorHAnsi" w:hAnsiTheme="minorHAnsi" w:cstheme="minorBidi"/>
+          <w:color w:val="auto"/>
+          <w:kern w:val="2"/>
+          <w:sz w:val="24"/>
+          <w:szCs w:val="24"/>
+          <w:lang w:val="ru-RU"/>
+          <w14:ligatures w14:val="standardContextual"/>
+        </w:rPr>
         <w:id w:val="1697585532"/>
         <w:docPartObj>
           <w:docPartGallery w:val="Table of Contents"/>
@@ -12,16 +21,9 @@
       </w:sdtPr>
       <w:sdtEndPr>
         <w:rPr>
-          <w:rFonts w:asciiTheme="minorHAnsi" w:eastAsiaTheme="minorHAnsi" w:hAnsiTheme="minorHAnsi" w:cstheme="minorBidi"/>
           <w:b/>
           <w:bCs/>
           <w:noProof/>
-          <w:color w:val="auto"/>
-          <w:kern w:val="2"/>
-          <w:sz w:val="24"/>
-          <w:szCs w:val="24"/>
-          <w:lang w:val="ru-RU"/>
-          <w14:ligatures w14:val="standardContextual"/>
         </w:rPr>
       </w:sdtEndPr>
       <w:sdtContent>
@@ -66,21 +68,7 @@
                 <w:rStyle w:val="Hyperlink"/>
                 <w:noProof/>
               </w:rPr>
-              <w:t>Предвар</w:t>
-            </w:r>
-            <w:r>
-              <w:rPr>
-                <w:rStyle w:val="Hyperlink"/>
-                <w:noProof/>
-              </w:rPr>
-              <w:t>и</w:t>
-            </w:r>
-            <w:r>
-              <w:rPr>
-                <w:rStyle w:val="Hyperlink"/>
-                <w:noProof/>
-              </w:rPr>
-              <w:t>тельное создание текстов/картинок контента.</w:t>
+              <w:t>Предварительное создание текстов/картинок контента.</w:t>
             </w:r>
             <w:r>
               <w:rPr>
@@ -873,19 +861,7 @@
         <w:rPr>
           <w:color w:val="auto"/>
         </w:rPr>
-        <w:t>Предварительное создание текстов</w:t>
-      </w:r>
-      <w:r>
-        <w:rPr>
-          <w:color w:val="auto"/>
-        </w:rPr>
-        <w:t>/картинок</w:t>
-      </w:r>
-      <w:r>
-        <w:rPr>
-          <w:color w:val="auto"/>
-        </w:rPr>
-        <w:t xml:space="preserve"> контента.</w:t>
+        <w:t>Предварительное создание текстов/картинок контента.</w:t>
       </w:r>
       <w:bookmarkEnd w:id="0"/>
     </w:p>
@@ -1291,9 +1267,6 @@
     <w:p>
       <w:pPr>
         <w:pStyle w:val="Heading1"/>
-        <w:rPr>
-          <w:lang w:val="en-US"/>
-        </w:rPr>
       </w:pPr>
       <w:bookmarkStart w:id="1" w:name="_Toc243239327"/>
       <w:r>
@@ -1513,43 +1486,7 @@
         <w:rPr>
           <w:color w:val="00B0F0"/>
         </w:rPr>
-        <w:t>Р</w:t>
-      </w:r>
-      <w:r>
-        <w:rPr>
-          <w:color w:val="00B0F0"/>
-        </w:rPr>
-        <w:t>егулярно</w:t>
-      </w:r>
-      <w:r>
-        <w:rPr>
-          <w:color w:val="00B0F0"/>
-        </w:rPr>
-        <w:t>е</w:t>
-      </w:r>
-      <w:r>
-        <w:rPr>
-          <w:color w:val="00B0F0"/>
-        </w:rPr>
-        <w:t xml:space="preserve"> выражени</w:t>
-      </w:r>
-      <w:r>
-        <w:rPr>
-          <w:color w:val="00B0F0"/>
-        </w:rPr>
-        <w:t>е было исправлено (</w:t>
-      </w:r>
-      <w:r>
-        <w:rPr>
-          <w:color w:val="00B0F0"/>
-        </w:rPr>
-        <w:t>проверяло код оператора по наличию двух цифр ( \d{2} ), что может быть некорректно для белорусских операторов</w:t>
-      </w:r>
-      <w:r>
-        <w:rPr>
-          <w:color w:val="00B0F0"/>
-        </w:rPr>
-        <w:t>) вручную</w:t>
+        <w:t>Регулярное выражение было исправлено (проверяло код оператора по наличию двух цифр ( \d{2} ), что может быть некорректно для белорусских операторов) вручную</w:t>
       </w:r>
       <w:r>
         <w:t>.</w:t>
@@ -1900,13 +1837,7 @@
         <w:rPr>
           <w:color w:val="auto"/>
         </w:rPr>
-        <w:t>Rate Limiting</w:t>
-      </w:r>
-      <w:r>
-        <w:rPr>
-          <w:color w:val="auto"/>
-        </w:rPr>
-        <w:t xml:space="preserve"> и дополнительные защиты.</w:t>
+        <w:t>Rate Limiting и дополнительные защиты.</w:t>
       </w:r>
       <w:bookmarkEnd w:id="5"/>
     </w:p>
@@ -3671,6 +3602,223 @@
         </w:drawing>
       </w:r>
     </w:p>
+    <w:p>
+      <w:r>
+        <w:t>Также я засомневался в предложенном ИИ</w:t>
+      </w:r>
+      <w:r>
+        <w:t xml:space="preserve"> коде сбора </w:t>
+      </w:r>
+      <w:r>
+        <w:t>UTM-меток</w:t>
+      </w:r>
+      <w:r>
+        <w:t xml:space="preserve">, </w:t>
+      </w:r>
+      <w:r>
+        <w:t>когда разбирался с UTM-метками вообще и изучал предложенный код. Я дополнительно проконсультировался с ИИ в другом чате</w:t>
+      </w:r>
+      <w:r>
+        <w:t>:</w:t>
+      </w:r>
+    </w:p>
+    <w:p>
+      <w:r>
+        <w:rPr>
+          <w:noProof/>
+        </w:rPr>
+        <w:drawing>
+          <wp:inline distT="0" distB="0" distL="0" distR="0" wp14:anchorId="464E3B7B" wp14:editId="1F2B9984">
+            <wp:extent cx="5940425" cy="3698875"/>
+            <wp:effectExtent l="0" t="0" r="3175" b="0"/>
+            <wp:docPr id="1188353360" name="Picture 1"/>
+            <wp:cNvGraphicFramePr>
+              <a:graphicFrameLocks xmlns:a="http://schemas.openxmlformats.org/drawingml/2006/main" noChangeAspect="1"/>
+            </wp:cNvGraphicFramePr>
+            <a:graphic xmlns:a="http://schemas.openxmlformats.org/drawingml/2006/main">
+              <a:graphicData uri="http://schemas.openxmlformats.org/drawingml/2006/picture">
+                <pic:pic xmlns:pic="http://schemas.openxmlformats.org/drawingml/2006/picture">
+                  <pic:nvPicPr>
+                    <pic:cNvPr id="1188353360" name="Picture 1188353360"/>
+                    <pic:cNvPicPr/>
+                  </pic:nvPicPr>
+                  <pic:blipFill>
+                    <a:blip r:embed="rId49">
+                      <a:extLst>
+                        <a:ext uri="{28A0092B-C50C-407E-A947-70E740481C1C}">
+                          <a14:useLocalDpi xmlns:a14="http://schemas.microsoft.com/office/drawing/2010/main" val="0"/>
+                        </a:ext>
+                      </a:extLst>
+                    </a:blip>
+                    <a:stretch>
+                      <a:fillRect/>
+                    </a:stretch>
+                  </pic:blipFill>
+                  <pic:spPr>
+                    <a:xfrm>
+                      <a:off x="0" y="0"/>
+                      <a:ext cx="5940425" cy="3698875"/>
+                    </a:xfrm>
+                    <a:prstGeom prst="rect">
+                      <a:avLst/>
+                    </a:prstGeom>
+                  </pic:spPr>
+                </pic:pic>
+              </a:graphicData>
+            </a:graphic>
+          </wp:inline>
+        </w:drawing>
+      </w:r>
+    </w:p>
+    <w:p>
+      <w:r>
+        <w:rPr>
+          <w:noProof/>
+        </w:rPr>
+        <w:lastRenderedPageBreak/>
+        <w:drawing>
+          <wp:inline distT="0" distB="0" distL="0" distR="0" wp14:anchorId="44EF2361" wp14:editId="757C9111">
+            <wp:extent cx="5940425" cy="4450080"/>
+            <wp:effectExtent l="0" t="0" r="3175" b="7620"/>
+            <wp:docPr id="1273951016" name="Picture 2"/>
+            <wp:cNvGraphicFramePr>
+              <a:graphicFrameLocks xmlns:a="http://schemas.openxmlformats.org/drawingml/2006/main" noChangeAspect="1"/>
+            </wp:cNvGraphicFramePr>
+            <a:graphic xmlns:a="http://schemas.openxmlformats.org/drawingml/2006/main">
+              <a:graphicData uri="http://schemas.openxmlformats.org/drawingml/2006/picture">
+                <pic:pic xmlns:pic="http://schemas.openxmlformats.org/drawingml/2006/picture">
+                  <pic:nvPicPr>
+                    <pic:cNvPr id="1273951016" name="Picture 1273951016"/>
+                    <pic:cNvPicPr/>
+                  </pic:nvPicPr>
+                  <pic:blipFill>
+                    <a:blip r:embed="rId50">
+                      <a:extLst>
+                        <a:ext uri="{28A0092B-C50C-407E-A947-70E740481C1C}">
+                          <a14:useLocalDpi xmlns:a14="http://schemas.microsoft.com/office/drawing/2010/main" val="0"/>
+                        </a:ext>
+                      </a:extLst>
+                    </a:blip>
+                    <a:stretch>
+                      <a:fillRect/>
+                    </a:stretch>
+                  </pic:blipFill>
+                  <pic:spPr>
+                    <a:xfrm>
+                      <a:off x="0" y="0"/>
+                      <a:ext cx="5940425" cy="4450080"/>
+                    </a:xfrm>
+                    <a:prstGeom prst="rect">
+                      <a:avLst/>
+                    </a:prstGeom>
+                  </pic:spPr>
+                </pic:pic>
+              </a:graphicData>
+            </a:graphic>
+          </wp:inline>
+        </w:drawing>
+      </w:r>
+    </w:p>
+    <w:p>
+      <w:r>
+        <w:rPr>
+          <w:noProof/>
+        </w:rPr>
+        <w:lastRenderedPageBreak/>
+        <w:drawing>
+          <wp:inline distT="0" distB="0" distL="0" distR="0" wp14:anchorId="1BD4AEEC" wp14:editId="31771F1A">
+            <wp:extent cx="5940425" cy="4987925"/>
+            <wp:effectExtent l="0" t="0" r="3175" b="3175"/>
+            <wp:docPr id="1675970386" name="Picture 3"/>
+            <wp:cNvGraphicFramePr>
+              <a:graphicFrameLocks xmlns:a="http://schemas.openxmlformats.org/drawingml/2006/main" noChangeAspect="1"/>
+            </wp:cNvGraphicFramePr>
+            <a:graphic xmlns:a="http://schemas.openxmlformats.org/drawingml/2006/main">
+              <a:graphicData uri="http://schemas.openxmlformats.org/drawingml/2006/picture">
+                <pic:pic xmlns:pic="http://schemas.openxmlformats.org/drawingml/2006/picture">
+                  <pic:nvPicPr>
+                    <pic:cNvPr id="1675970386" name="Picture 1675970386"/>
+                    <pic:cNvPicPr/>
+                  </pic:nvPicPr>
+                  <pic:blipFill>
+                    <a:blip r:embed="rId51">
+                      <a:extLst>
+                        <a:ext uri="{28A0092B-C50C-407E-A947-70E740481C1C}">
+                          <a14:useLocalDpi xmlns:a14="http://schemas.microsoft.com/office/drawing/2010/main" val="0"/>
+                        </a:ext>
+                      </a:extLst>
+                    </a:blip>
+                    <a:stretch>
+                      <a:fillRect/>
+                    </a:stretch>
+                  </pic:blipFill>
+                  <pic:spPr>
+                    <a:xfrm>
+                      <a:off x="0" y="0"/>
+                      <a:ext cx="5940425" cy="4987925"/>
+                    </a:xfrm>
+                    <a:prstGeom prst="rect">
+                      <a:avLst/>
+                    </a:prstGeom>
+                  </pic:spPr>
+                </pic:pic>
+              </a:graphicData>
+            </a:graphic>
+          </wp:inline>
+        </w:drawing>
+      </w:r>
+    </w:p>
+    <w:p>
+      <w:r>
+        <w:rPr>
+          <w:noProof/>
+        </w:rPr>
+        <w:lastRenderedPageBreak/>
+        <w:drawing>
+          <wp:inline distT="0" distB="0" distL="0" distR="0" wp14:anchorId="22375472" wp14:editId="40A09DBB">
+            <wp:extent cx="5940425" cy="4684395"/>
+            <wp:effectExtent l="0" t="0" r="3175" b="1905"/>
+            <wp:docPr id="1752054292" name="Picture 4"/>
+            <wp:cNvGraphicFramePr>
+              <a:graphicFrameLocks xmlns:a="http://schemas.openxmlformats.org/drawingml/2006/main" noChangeAspect="1"/>
+            </wp:cNvGraphicFramePr>
+            <a:graphic xmlns:a="http://schemas.openxmlformats.org/drawingml/2006/main">
+              <a:graphicData uri="http://schemas.openxmlformats.org/drawingml/2006/picture">
+                <pic:pic xmlns:pic="http://schemas.openxmlformats.org/drawingml/2006/picture">
+                  <pic:nvPicPr>
+                    <pic:cNvPr id="1752054292" name="Picture 1752054292"/>
+                    <pic:cNvPicPr/>
+                  </pic:nvPicPr>
+                  <pic:blipFill>
+                    <a:blip r:embed="rId52">
+                      <a:extLst>
+                        <a:ext uri="{28A0092B-C50C-407E-A947-70E740481C1C}">
+                          <a14:useLocalDpi xmlns:a14="http://schemas.microsoft.com/office/drawing/2010/main" val="0"/>
+                        </a:ext>
+                      </a:extLst>
+                    </a:blip>
+                    <a:stretch>
+                      <a:fillRect/>
+                    </a:stretch>
+                  </pic:blipFill>
+                  <pic:spPr>
+                    <a:xfrm>
+                      <a:off x="0" y="0"/>
+                      <a:ext cx="5940425" cy="4684395"/>
+                    </a:xfrm>
+                    <a:prstGeom prst="rect">
+                      <a:avLst/>
+                    </a:prstGeom>
+                  </pic:spPr>
+                </pic:pic>
+              </a:graphicData>
+            </a:graphic>
+          </wp:inline>
+        </w:drawing>
+      </w:r>
+    </w:p>
+    <w:p/>
+    <w:p/>
     <w:p/>
     <w:p/>
     <w:p/>
@@ -5110,6 +5258,36 @@
       <w:ind w:left="240"/>
     </w:pPr>
   </w:style>
+  <w:style w:type="paragraph" w:styleId="HTMLPreformatted">
+    <w:name w:val="HTML Preformatted"/>
+    <w:basedOn w:val="Normal"/>
+    <w:link w:val="HTMLPreformattedChar"/>
+    <w:uiPriority w:val="99"/>
+    <w:semiHidden/>
+    <w:unhideWhenUsed/>
+    <w:rsid w:val="00A945D7"/>
+    <w:pPr>
+      <w:spacing w:after="0" w:line="240" w:lineRule="auto"/>
+    </w:pPr>
+    <w:rPr>
+      <w:rFonts w:ascii="Consolas" w:hAnsi="Consolas"/>
+      <w:sz w:val="20"/>
+      <w:szCs w:val="20"/>
+    </w:rPr>
+  </w:style>
+  <w:style w:type="character" w:customStyle="1" w:styleId="HTMLPreformattedChar">
+    <w:name w:val="HTML Preformatted Char"/>
+    <w:basedOn w:val="DefaultParagraphFont"/>
+    <w:link w:val="HTMLPreformatted"/>
+    <w:uiPriority w:val="99"/>
+    <w:semiHidden/>
+    <w:rsid w:val="00A945D7"/>
+    <w:rPr>
+      <w:rFonts w:ascii="Consolas" w:hAnsi="Consolas"/>
+      <w:sz w:val="20"/>
+      <w:szCs w:val="20"/>
+    </w:rPr>
+  </w:style>
 </w:styles>
 </file>
 

</xml_diff>